<commit_message>
cicd: desactiva la aprobacion manual en dev; docs: actualiza el pipeline a tres etapas
</commit_message>
<xml_diff>
--- a/docs/Lab3-Documentacion-Tecnica.docx
+++ b/docs/Lab3-Documentacion-Tecnica.docx
@@ -1238,7 +1238,7 @@
       <w:pPr>
         <w:spacing w:after="100"/>
       </w:pPr>
-      <w:hyperlink w:history="1" r:id="rIdfxpk-hrswukp_eikvkr5o">
+      <w:hyperlink w:history="1" r:id="rId3gqylai5-sx2vy3vyuwi2">
         <w:r>
           <w:rPr>
             <w:rStyle w:val="Hyperlink"/>
@@ -1262,7 +1262,7 @@
       <w:pPr>
         <w:spacing w:after="100"/>
       </w:pPr>
-      <w:hyperlink w:history="1" r:id="rIdkbhqqxfzohwxvgwbdnerl">
+      <w:hyperlink w:history="1" r:id="rIdtkaqaxshqfsxgbrqfqduh">
         <w:r>
           <w:rPr>
             <w:rStyle w:val="Hyperlink"/>
@@ -4953,7 +4953,7 @@
         <w:jc w:val="both"/>
       </w:pPr>
       <w:r>
-        <w:t xml:space="preserve">El pipeline tiene cuatro etapas:</w:t>
+        <w:t xml:space="preserve">El pipeline tiene tres etapas:</w:t>
       </w:r>
     </w:p>
     <w:tbl>
@@ -5196,7 +5196,7 @@
               <w:spacing w:after="0"/>
             </w:pPr>
             <w:r>
-              <w:t xml:space="preserve">Approval</w:t>
+              <w:t xml:space="preserve">Deploy</w:t>
             </w:r>
           </w:p>
         </w:tc>
@@ -5215,75 +5215,13 @@
               <w:spacing w:after="0"/>
             </w:pPr>
             <w:r>
-              <w:t xml:space="preserve">Manual</w:t>
+              <w:t xml:space="preserve">Amazon ECS</w:t>
             </w:r>
           </w:p>
         </w:tc>
         <w:tc>
           <w:tcPr>
             <w:tcW w:type="dxa" w:w="4626"/>
-            <w:tcMar>
-              <w:top w:type="dxa" w:w="80"/>
-              <w:left w:type="dxa" w:w="120"/>
-              <w:bottom w:type="dxa" w:w="80"/>
-              <w:right w:type="dxa" w:w="120"/>
-            </w:tcMar>
-          </w:tcPr>
-          <w:p>
-            <w:pPr>
-              <w:spacing w:after="0"/>
-            </w:pPr>
-            <w:r>
-              <w:t xml:space="preserve">Notifica por SNS y detiene la ejecución hasta que una persona apruebe o rechace</w:t>
-            </w:r>
-          </w:p>
-        </w:tc>
-      </w:tr>
-      <w:tr>
-        <w:tc>
-          <w:tcPr>
-            <w:tcW w:type="dxa" w:w="1600"/>
-            <w:shd w:fill="FAFAFA" w:val="clear"/>
-            <w:tcMar>
-              <w:top w:type="dxa" w:w="80"/>
-              <w:left w:type="dxa" w:w="120"/>
-              <w:bottom w:type="dxa" w:w="80"/>
-              <w:right w:type="dxa" w:w="120"/>
-            </w:tcMar>
-          </w:tcPr>
-          <w:p>
-            <w:pPr>
-              <w:spacing w:after="0"/>
-            </w:pPr>
-            <w:r>
-              <w:t xml:space="preserve">Deploy</w:t>
-            </w:r>
-          </w:p>
-        </w:tc>
-        <w:tc>
-          <w:tcPr>
-            <w:tcW w:type="dxa" w:w="2800"/>
-            <w:shd w:fill="FAFAFA" w:val="clear"/>
-            <w:tcMar>
-              <w:top w:type="dxa" w:w="80"/>
-              <w:left w:type="dxa" w:w="120"/>
-              <w:bottom w:type="dxa" w:w="80"/>
-              <w:right w:type="dxa" w:w="120"/>
-            </w:tcMar>
-          </w:tcPr>
-          <w:p>
-            <w:pPr>
-              <w:spacing w:after="0"/>
-            </w:pPr>
-            <w:r>
-              <w:t xml:space="preserve">Amazon ECS</w:t>
-            </w:r>
-          </w:p>
-        </w:tc>
-        <w:tc>
-          <w:tcPr>
-            <w:tcW w:type="dxa" w:w="4626"/>
-            <w:shd w:fill="FAFAFA" w:val="clear"/>
             <w:tcMar>
               <w:top w:type="dxa" w:w="80"/>
               <w:left w:type="dxa" w:w="120"/>
@@ -5333,129 +5271,7 @@
         <w:spacing w:after="110" w:before="220"/>
       </w:pPr>
       <w:r>
-        <w:t xml:space="preserve">4.9.3. Compuerta de aprobación manual</w:t>
-      </w:r>
-    </w:p>
-    <w:p>
-      <w:pPr>
-        <w:spacing w:after="140" w:line="276"/>
-        <w:jc w:val="both"/>
-      </w:pPr>
-      <w:r>
-        <w:t xml:space="preserve">Entre la construcción de la imagen y el despliegue se interpone una etapa de aprobación manual. Al alcanzarla, CodePipeline publica un aviso en el tópico de SNS y la ejecución queda detenida hasta que una persona apruebe o rechace desde la consola.</w:t>
-      </w:r>
-    </w:p>
-    <w:p>
-      <w:pPr>
-        <w:spacing w:after="140" w:line="276"/>
-        <w:jc w:val="both"/>
-      </w:pPr>
-      <w:r>
-        <w:t xml:space="preserve">Conviene precisar qué controla exactamente esa compuerta: al llegar a ese punto la imagen </w:t>
-      </w:r>
-      <w:r>
-        <w:rPr>
-          <w:b/>
-          <w:bCs/>
-        </w:rPr>
-        <w:t xml:space="preserve">ya fue construida y publicada en ECR</w:t>
-      </w:r>
-      <w:r>
-        <w:t xml:space="preserve">. Lo único que queda pendiente es la actualización del servicio ECS. La aprobación no valida el build — eso ya ocurrió — sino que decide el momento en que el cambio alcanza el entorno en ejecución, y deja registrado quién lo autorizó.</w:t>
-      </w:r>
-    </w:p>
-    <w:p>
-      <w:pPr>
-        <w:spacing w:after="140" w:line="276"/>
-        <w:jc w:val="both"/>
-      </w:pPr>
-      <w:r>
-        <w:t xml:space="preserve">La etapa se controla con la variable </w:t>
-      </w:r>
-      <w:r>
-        <w:rPr>
-          <w:rFonts w:ascii="Consolas" w:cs="Consolas" w:eastAsia="Consolas" w:hAnsi="Consolas"/>
-          <w:sz w:val="19"/>
-          <w:szCs w:val="19"/>
-        </w:rPr>
-        <w:t xml:space="preserve">enable_manual_approval</w:t>
-      </w:r>
-      <w:r>
-        <w:t xml:space="preserve">, de modo que un entorno de desarrollo puede desactivarla sin modificar el módulo. El aviso incluye además un enlace al entorno desplegado, para que quien aprueba tenga a mano la referencia de lo que está por reemplazar.</w:t>
-      </w:r>
-    </w:p>
-    <w:p>
-      <w:pPr>
-        <w:pBdr>
-          <w:left w:val="single" w:color="8DC63F" w:sz="18" w:space="8"/>
-        </w:pBdr>
-        <w:shd w:fill="FFF9E6" w:val="clear"/>
-        <w:spacing w:after="180" w:before="120" w:line="276"/>
-        <w:ind w:left="180" w:right="120"/>
-      </w:pPr>
-      <w:r>
-        <w:rPr>
-          <w:b/>
-          <w:bCs/>
-          <w:color w:val="58595B"/>
-        </w:rPr>
-        <w:t xml:space="preserve">Nota: </w:t>
-      </w:r>
-      <w:r>
-        <w:t xml:space="preserve">La acción de aprobación publica en SNS con la identidad del propio pipeline, por lo que su rol de IAM necesita permiso explícito de </w:t>
-      </w:r>
-      <w:r>
-        <w:rPr>
-          <w:rFonts w:ascii="Consolas" w:cs="Consolas" w:eastAsia="Consolas" w:hAnsi="Consolas"/>
-          <w:sz w:val="19"/>
-          <w:szCs w:val="19"/>
-        </w:rPr>
-        <w:t xml:space="preserve">sns:Publish</w:t>
-      </w:r>
-      <w:r>
-        <w:t xml:space="preserve"> sobre el tópico. La regla de notificaciones incorpora además los eventos </w:t>
-      </w:r>
-      <w:r>
-        <w:rPr>
-          <w:rFonts w:ascii="Consolas" w:cs="Consolas" w:eastAsia="Consolas" w:hAnsi="Consolas"/>
-          <w:sz w:val="19"/>
-          <w:szCs w:val="19"/>
-        </w:rPr>
-        <w:t xml:space="preserve">manual-approval-needed</w:t>
-      </w:r>
-      <w:r>
-        <w:t xml:space="preserve">, </w:t>
-      </w:r>
-      <w:r>
-        <w:rPr>
-          <w:rFonts w:ascii="Consolas" w:cs="Consolas" w:eastAsia="Consolas" w:hAnsi="Consolas"/>
-          <w:sz w:val="19"/>
-          <w:szCs w:val="19"/>
-        </w:rPr>
-        <w:t xml:space="preserve">succeeded</w:t>
-      </w:r>
-      <w:r>
-        <w:t xml:space="preserve"> y </w:t>
-      </w:r>
-      <w:r>
-        <w:rPr>
-          <w:rFonts w:ascii="Consolas" w:cs="Consolas" w:eastAsia="Consolas" w:hAnsi="Consolas"/>
-          <w:sz w:val="19"/>
-          <w:szCs w:val="19"/>
-        </w:rPr>
-        <w:t xml:space="preserve">failed</w:t>
-      </w:r>
-      <w:r>
-        <w:t xml:space="preserve">, para que la compuerta no dependa de que alguien mire la consola por casualidad.</w:t>
-      </w:r>
-    </w:p>
-    <w:p>
-      <w:pPr>
-        <w:pStyle w:val="Heading3"/>
-        <w:spacing w:after="110" w:before="220"/>
-      </w:pPr>
-      <w:r>
-        <w:t xml:space="preserve">4.9.4. Variables de entorno del registry</w:t>
+        <w:t xml:space="preserve">4.9.3. Variables de entorno del registry</w:t>
       </w:r>
     </w:p>
     <w:p>
@@ -5866,7 +5682,7 @@
         <w:spacing w:after="110" w:before="220"/>
       </w:pPr>
       <w:r>
-        <w:t xml:space="preserve">4.9.5. Origen de las imágenes base</w:t>
+        <w:t xml:space="preserve">4.9.4. Origen de las imágenes base</w:t>
       </w:r>
     </w:p>
     <w:p>
@@ -5944,6 +5760,59 @@
       </w:r>
       <w:r>
         <w:t xml:space="preserve">. Esa descarga la realizan las instancias EC2 del cluster, que también salen a internet a través del NAT Gateway con una dirección compartida, por lo que estaban expuestas al mismo límite aunque todavía no hubiera fallado.</w:t>
+      </w:r>
+    </w:p>
+    <w:p>
+      <w:pPr>
+        <w:pBdr>
+          <w:left w:val="single" w:color="8DC63F" w:sz="18" w:space="8"/>
+        </w:pBdr>
+        <w:shd w:fill="FFF9E6" w:val="clear"/>
+        <w:spacing w:after="180" w:before="120" w:line="276"/>
+        <w:ind w:left="180" w:right="120"/>
+      </w:pPr>
+      <w:r>
+        <w:rPr>
+          <w:b/>
+          <w:bCs/>
+          <w:color w:val="58595B"/>
+        </w:rPr>
+        <w:t xml:space="preserve">Nota: </w:t>
+      </w:r>
+      <w:r>
+        <w:t xml:space="preserve">El módulo implementa además una compuerta de aprobación manual opcional entre la construcción y el despliegue, controlada por la variable </w:t>
+      </w:r>
+      <w:r>
+        <w:rPr>
+          <w:rFonts w:ascii="Consolas" w:cs="Consolas" w:eastAsia="Consolas" w:hAnsi="Consolas"/>
+          <w:sz w:val="19"/>
+          <w:szCs w:val="19"/>
+        </w:rPr>
+        <w:t xml:space="preserve">enable_manual_approval</w:t>
+      </w:r>
+      <w:r>
+        <w:t xml:space="preserve">. Está </w:t>
+      </w:r>
+      <w:r>
+        <w:rPr>
+          <w:b/>
+          <w:bCs/>
+        </w:rPr>
+        <w:t xml:space="preserve">desactivada</w:t>
+      </w:r>
+      <w:r>
+        <w:t xml:space="preserve"> en este entorno: el despliegue a </w:t>
+      </w:r>
+      <w:r>
+        <w:rPr>
+          <w:rFonts w:ascii="Consolas" w:cs="Consolas" w:eastAsia="Consolas" w:hAnsi="Consolas"/>
+          <w:sz w:val="19"/>
+          <w:szCs w:val="19"/>
+        </w:rPr>
+        <w:t xml:space="preserve">dev</w:t>
+      </w:r>
+      <w:r>
+        <w:t xml:space="preserve"> es automático de punta a punta, como exige el enunciado. Se deja disponible para poder habilitarla con un booleano en un entorno productivo, donde controlar el momento del despliegue sí resulta relevante.</w:t>
       </w:r>
     </w:p>
     <w:p>
@@ -9407,7 +9276,7 @@
       <w:pPr>
         <w:spacing w:after="100"/>
       </w:pPr>
-      <w:hyperlink w:history="1" r:id="rId_ose7ueojublzg51rpqji">
+      <w:hyperlink w:history="1" r:id="rIdcztmwhdbxfoayxybgalsg">
         <w:r>
           <w:rPr>
             <w:rStyle w:val="Hyperlink"/>
@@ -9431,7 +9300,7 @@
       <w:pPr>
         <w:spacing w:after="100"/>
       </w:pPr>
-      <w:hyperlink w:history="1" r:id="rIddxqxldz3pz7n4-aixa292">
+      <w:hyperlink w:history="1" r:id="rId9tyib3vlj1auagjadqueo">
         <w:r>
           <w:rPr>
             <w:rStyle w:val="Hyperlink"/>
@@ -10753,7 +10622,7 @@
               <w:spacing w:after="0"/>
             </w:pPr>
             <w:r>
-              <w:t xml:space="preserve">Cumplido — con aprobación manual previa al despliegue</w:t>
+              <w:t xml:space="preserve">Cumplido</w:t>
             </w:r>
           </w:p>
         </w:tc>

</xml_diff>